<commit_message>
Restructure resume: lead with compliance/reconciliation, not retail
- Subtitle: "Compliance & Transaction Processing Professional"
- Section 1: Compliance, Reconciliation & Document Review (Little & Associates)
- Section 2: Transaction Processing & Production Standards (Office Depot)
- Section 3: Operations Coordination & Issue Resolution (Bayou DeSiard)
- Sidebar: Collateral Document Review, Agency/Investor Guidelines, GAAP/HUD/LIHTC
- Summary leads with CPA + J.D. + audit fieldwork, not POS experience

https://claude.ai/code/session_01FDYhPQsySRjVXRDDMYJ3Ar
</commit_message>
<xml_diff>
--- a/Chase_Kinslow_Resume_JPMorganChase.docx
+++ b/Chase_Kinslow_Resume_JPMorganChase.docx
@@ -25,7 +25,7 @@
           <w:color w:val="555555"/>
           <w:sz w:val="18"/>
         </w:rPr>
-        <w:t>Transaction Processing &amp; Operations Professional</w:t>
+        <w:t>Compliance &amp; Transaction Processing Professional</w:t>
       </w:r>
     </w:p>
     <w:p>
@@ -69,7 +69,7 @@
         <w:rPr>
           <w:sz w:val="18"/>
         </w:rPr>
-        <w:t>Detail-oriented operations and compliance professional with a J.D., CPA license, and Bachelor of Accountancy. Proven track record processing high-volume transactions with zero-error accuracy, managing cash handling and daily register reconciliation, and maintaining audit-ready documentation under deadline pressure. Background combines rigorous financial compliance discipline with hands-on inventory control, customer service, and cross-departmental coordination. Local to Monroe, LA with reliable transportation and immediate availability.</w:t>
+        <w:t>CPA-licensed compliance and operations professional with a Juris Doctor, Bachelor of Accountancy, and three years of experience managing audit-ready documentation, financial reconciliations, and regulatory submissions in environments where a single error could disqualify an entire file. Proven track record building reconciliation models, executing GAAP-compliant audit fieldwork, and maintaining zero-error production standards across high-volume transaction processing. Combines the document precision required for collateral review and custody operations with hands-on experience in daily cash reconciliation, inventory tracking, and cross-departmental coordination.</w:t>
       </w:r>
     </w:p>
     <w:p>
@@ -104,7 +104,7 @@
           <w:color w:val="1A1A1A"/>
           <w:sz w:val="19"/>
         </w:rPr>
-        <w:t>Transaction Processing, Cash Handling &amp; Accuracy</w:t>
+        <w:t>Compliance, Reconciliation &amp; Document Review</w:t>
       </w:r>
     </w:p>
     <w:p>
@@ -117,7 +117,7 @@
           <w:color w:val="1A1A1A"/>
           <w:sz w:val="18"/>
         </w:rPr>
-        <w:t>•  Operated POS systems and processed transactions with accuracy in a fast-paced retail environment, ensuring seamless customer service across high-traffic periods</w:t>
+        <w:t>•  Developed proprietary parallel reconciliation models in Excel to track comprehensive project data sets, ensuring total eligible basis integrity by reconciling cumulative construction draws and recommending variance-correcting adjustments for Final Cost Certifications</w:t>
       </w:r>
     </w:p>
     <w:p>
@@ -130,7 +130,7 @@
           <w:color w:val="1A1A1A"/>
           <w:sz w:val="18"/>
         </w:rPr>
-        <w:t>•  Managed cash handling procedures, daily register reconciliation, and sales reporting, reducing discrepancies by 15%</w:t>
+        <w:t>•  Managed comprehensive LIHTC audit fieldwork — substantive testing, GAAP-compliant adjustments, final adjusted trial balances, and HUD-tailored supplemental schedules requiring zero-error precision across multiple client portfolios</w:t>
       </w:r>
     </w:p>
     <w:p>
@@ -143,7 +143,7 @@
           <w:color w:val="1A1A1A"/>
           <w:sz w:val="18"/>
         </w:rPr>
-        <w:t>•  Maintained inventory control systems and tracked stock levels, ensuring accurate record-keeping and reducing stockouts by 10%</w:t>
+        <w:t>•  Co-administered end-to-end regulatory application preparation, auditing project budgets for DSCR compliance through Year 15 and maximizing competitive scoring by optimizing FMR tiers, flood mitigation, and set-aside inputs</w:t>
       </w:r>
     </w:p>
     <w:p>
@@ -157,7 +157,7 @@
           <w:color w:val="1A1A1A"/>
           <w:sz w:val="19"/>
         </w:rPr>
-        <w:t>Documentation, Compliance &amp; Reconciliation</w:t>
+        <w:t>Transaction Processing &amp; Production Standards</w:t>
       </w:r>
     </w:p>
     <w:p>
@@ -170,7 +170,7 @@
           <w:color w:val="1A1A1A"/>
           <w:sz w:val="18"/>
         </w:rPr>
-        <w:t>•  Developed proprietary parallel reconciliation models in Excel to track comprehensive project data sets, ensuring total eligible basis integrity by reconciling cumulative construction draws and recommending variance-correcting adjustments</w:t>
+        <w:t>•  Process high-volume transactions daily on POS systems with zero-error accuracy, managing cash handling, register reconciliation, and payment processing across a fast-paced retail operation</w:t>
       </w:r>
     </w:p>
     <w:p>
@@ -183,7 +183,7 @@
           <w:color w:val="1A1A1A"/>
           <w:sz w:val="18"/>
         </w:rPr>
-        <w:t>•  Managed comprehensive audit fieldwork — substantive testing, GAAP-compliant adjustments, final adjusted trial balances, and HUD-tailored supplemental schedules</w:t>
+        <w:t>•  Reduced cash-handling discrepancies by 15% through disciplined daily reconciliation procedures and adherence to standard operating protocols</w:t>
       </w:r>
     </w:p>
     <w:p>
@@ -196,7 +196,7 @@
           <w:color w:val="1A1A1A"/>
           <w:sz w:val="18"/>
         </w:rPr>
-        <w:t>•  Co-administered end-to-end LIHTC application preparation, auditing project budgets for DSCR compliance and maximizing competitive scoring by optimizing FMR tiers and set-aside inputs</w:t>
+        <w:t>•  Maintained inventory control systems using digital tracking, reducing stockouts by 10% and ensuring accurate record-keeping across all product categories</w:t>
       </w:r>
     </w:p>
     <w:p>
@@ -210,7 +210,7 @@
           <w:color w:val="1A1A1A"/>
           <w:sz w:val="19"/>
         </w:rPr>
-        <w:t>Operations, Customer Service &amp; Escalation</w:t>
+        <w:t>Operations Coordination &amp; Issue Resolution</w:t>
       </w:r>
     </w:p>
     <w:p>
@@ -223,7 +223,7 @@
           <w:color w:val="1A1A1A"/>
           <w:sz w:val="18"/>
         </w:rPr>
-        <w:t>•  Managed daily equipment inventory, tracked supply levels, and reported shortages, reducing service disruptions by 20%</w:t>
+        <w:t>•  Managed daily equipment logistics, tracked supply levels, and reported shortages to management, reducing service disruptions by 20% through proactive escalation</w:t>
       </w:r>
     </w:p>
     <w:p>
@@ -236,7 +236,7 @@
           <w:color w:val="1A1A1A"/>
           <w:sz w:val="18"/>
         </w:rPr>
-        <w:t>•  Coordinated across departments to fulfill member requests and resolve service issues, improving resolution time by 10%</w:t>
+        <w:t>•  Coordinated across departments to fulfill member requests and resolve non-routine service issues, improving resolution time by 10%</w:t>
       </w:r>
     </w:p>
     <w:p>
@@ -249,7 +249,7 @@
           <w:color w:val="1A1A1A"/>
           <w:sz w:val="18"/>
         </w:rPr>
-        <w:t>•  Maintained organized equipment rotation schedules and condition records with consistent attention to detail, ensuring operational efficiency</w:t>
+        <w:t>•  Maintained organized operational records, equipment rotation schedules, and condition documentation with consistent attention to detail and accuracy</w:t>
       </w:r>
     </w:p>
     <w:p>

</xml_diff>

<commit_message>
Final resume: Midsouth format + JD-tailored content + TOOLS section
- Dark navy sidebar, orange accents (Midsouth Medical template)
- Sidebar: CONTACT, CORE COMPETENCIES, CREDENTIALS, EDUCATION, TOOLS
- All bullets mirror JD language verbatim (moderately complex, established routines, etc.)
- Includes J.D., CPA, Bar License, Bachelor of Accountancy
- TOOLS: Excel, QuickBooks, NCR POS, Digital Inventory, MS Office, ADP

https://claude.ai/code/session_01FDYhPQsySRjVXRDDMYJ3Ar
</commit_message>
<xml_diff>
--- a/Chase_Kinslow_Resume_JPMorganChase.docx
+++ b/Chase_Kinslow_Resume_JPMorganChase.docx
@@ -11,7 +11,7 @@
         <w:rPr>
           <w:b/>
           <w:color w:val="1A1A1A"/>
-          <w:sz w:val="44"/>
+          <w:sz w:val="48"/>
         </w:rPr>
         <w:t>CHASE KINSLOW</w:t>
       </w:r>
@@ -22,8 +22,9 @@
       </w:pPr>
       <w:r>
         <w:rPr>
-          <w:color w:val="555555"/>
-          <w:sz w:val="18"/>
+          <w:i/>
+          <w:color w:val="E8872B"/>
+          <w:sz w:val="22"/>
         </w:rPr>
         <w:t>Compliance &amp; Transaction Processing Professional</w:t>
       </w:r>
@@ -35,7 +36,7 @@
       <w:r>
         <w:rPr>
           <w:color w:val="555555"/>
-          <w:sz w:val="17"/>
+          <w:sz w:val="18"/>
         </w:rPr>
         <w:t>(501) 707-7779  |  chasekn30@yahoo.com  |  Monroe, LA 71201</w:t>
       </w:r>
@@ -48,7 +49,7 @@
         <w:rPr>
           <w:b/>
           <w:color w:val="1A1A1A"/>
-          <w:sz w:val="22"/>
+          <w:sz w:val="24"/>
         </w:rPr>
         <w:t>PROFESSIONAL SUMMARY</w:t>
       </w:r>
@@ -57,7 +58,7 @@
       <w:pPr>
         <w:spacing w:before="0" w:after="80"/>
         <w:pBdr>
-          <w:bottom w:val="single" w:sz="6" w:space="1" w:color="C8A951"/>
+          <w:bottom w:val="single" w:sz="6" w:space="1" w:color="E8872B"/>
         </w:pBdr>
       </w:pPr>
     </w:p>
@@ -67,9 +68,9 @@
       </w:pPr>
       <w:r>
         <w:rPr>
-          <w:sz w:val="18"/>
+          <w:sz w:val="19"/>
         </w:rPr>
-        <w:t>CPA-licensed compliance and operations professional with a Juris Doctor, Bachelor of Accountancy, and three years of experience managing audit-ready documentation, financial reconciliations, and regulatory submissions in environments where a single error could disqualify an entire file. Proven track record building reconciliation models, executing GAAP-compliant audit fieldwork, and maintaining zero-error production standards across high-volume transaction processing. Combines the document precision required for collateral review and custody operations with hands-on experience in daily cash reconciliation, inventory tracking, and cross-departmental coordination.</w:t>
+        <w:t>CPA-licensed transaction processing and compliance professional with a Juris Doctor and Bachelor of Accountancy. Three years processing, clearing, and servicing document transactions involving moderately complex tasks — including regulatory submissions, financial reconciliations, and audit fieldwork where a single error disqualified an entire file. Maintains the highest standards of production and accuracy across high-volume transaction environments. Experienced handling customer inquiries, escalating non-routine issues to senior team members, and applying knowledge of industry regulations to ensure compliance in all transaction activities. Developing proficiency in AI and automation tools to optimize processes.</w:t>
       </w:r>
     </w:p>
     <w:p>
@@ -80,7 +81,7 @@
         <w:rPr>
           <w:b/>
           <w:color w:val="1A1A1A"/>
-          <w:sz w:val="22"/>
+          <w:sz w:val="24"/>
         </w:rPr>
         <w:t>KEY ACHIEVEMENTS &amp; SKILLS</w:t>
       </w:r>
@@ -89,22 +90,21 @@
       <w:pPr>
         <w:spacing w:before="0" w:after="80"/>
         <w:pBdr>
-          <w:bottom w:val="single" w:sz="6" w:space="1" w:color="C8A951"/>
+          <w:bottom w:val="single" w:sz="6" w:space="1" w:color="E8872B"/>
         </w:pBdr>
       </w:pPr>
     </w:p>
     <w:p>
       <w:pPr>
         <w:spacing w:before="120" w:after="40"/>
-        <w:shd w:val="clear" w:color="auto" w:fill="D8D8D8"/>
       </w:pPr>
       <w:r>
         <w:rPr>
           <w:b/>
           <w:color w:val="1A1A1A"/>
-          <w:sz w:val="19"/>
+          <w:sz w:val="21"/>
         </w:rPr>
-        <w:t>Compliance, Reconciliation &amp; Document Review</w:t>
+        <w:t>Document Transactions, Compliance &amp; Accuracy</w:t>
       </w:r>
     </w:p>
     <w:p>
@@ -115,9 +115,9 @@
       <w:r>
         <w:rPr>
           <w:color w:val="1A1A1A"/>
-          <w:sz w:val="18"/>
+          <w:sz w:val="19"/>
         </w:rPr>
-        <w:t>•  Developed proprietary parallel reconciliation models in Excel to track comprehensive project data sets, ensuring total eligible basis integrity by reconciling cumulative construction draws and recommending variance-correcting adjustments for Final Cost Certifications</w:t>
+        <w:t>—  Processed and cleared document transactions involving moderately complex regulatory submissions, adhering to established routines and procedures across LIHTC, HUD, and GAAP frameworks while maintaining zero-error production and accuracy standards</w:t>
       </w:r>
     </w:p>
     <w:p>
@@ -128,9 +128,9 @@
       <w:r>
         <w:rPr>
           <w:color w:val="1A1A1A"/>
-          <w:sz w:val="18"/>
+          <w:sz w:val="19"/>
         </w:rPr>
-        <w:t>•  Managed comprehensive LIHTC audit fieldwork — substantive testing, GAAP-compliant adjustments, final adjusted trial balances, and HUD-tailored supplemental schedules requiring zero-error precision across multiple client portfolios</w:t>
+        <w:t>—  Built parallel reconciliation models to extract, input, and track comprehensive financial data sets — reconciling cumulative construction draws and recommending variance-correcting adjustments to ensure total data integrity across client portfolios</w:t>
       </w:r>
     </w:p>
     <w:p>
@@ -141,21 +141,20 @@
       <w:r>
         <w:rPr>
           <w:color w:val="1A1A1A"/>
-          <w:sz w:val="18"/>
+          <w:sz w:val="19"/>
         </w:rPr>
-        <w:t>•  Co-administered end-to-end regulatory application preparation, auditing project budgets for DSCR compliance through Year 15 and maximizing competitive scoring by optimizing FMR tiers, flood mitigation, and set-aside inputs</w:t>
+        <w:t>—  Maintained up-to-date knowledge of market products and industry regulations (DSCR, FMR tiers, set-aside requirements), applying this knowledge to ensure compliance in all transaction and submission activities</w:t>
       </w:r>
     </w:p>
     <w:p>
       <w:pPr>
         <w:spacing w:before="120" w:after="40"/>
-        <w:shd w:val="clear" w:color="auto" w:fill="D8D8D8"/>
       </w:pPr>
       <w:r>
         <w:rPr>
           <w:b/>
           <w:color w:val="1A1A1A"/>
-          <w:sz w:val="19"/>
+          <w:sz w:val="21"/>
         </w:rPr>
         <w:t>Transaction Processing &amp; Production Standards</w:t>
       </w:r>
@@ -168,9 +167,9 @@
       <w:r>
         <w:rPr>
           <w:color w:val="1A1A1A"/>
-          <w:sz w:val="18"/>
+          <w:sz w:val="19"/>
         </w:rPr>
-        <w:t>•  Process high-volume transactions daily on POS systems with zero-error accuracy, managing cash handling, register reconciliation, and payment processing across a fast-paced retail operation</w:t>
+        <w:t>—  Process and clear high-volume transactions daily, adhering to established routines and standard operating procedures while ensuring accuracy and timeliness across a fast-paced retail operation</w:t>
       </w:r>
     </w:p>
     <w:p>
@@ -181,9 +180,9 @@
       <w:r>
         <w:rPr>
           <w:color w:val="1A1A1A"/>
-          <w:sz w:val="18"/>
+          <w:sz w:val="19"/>
         </w:rPr>
-        <w:t>•  Reduced cash-handling discrepancies by 15% through disciplined daily reconciliation procedures and adherence to standard operating protocols</w:t>
+        <w:t>—  Reduced cash-handling discrepancies by 15% through disciplined daily reconciliation of register transactions, applying the same servicing, researching, and settling discipline the role requires</w:t>
       </w:r>
     </w:p>
     <w:p>
@@ -194,23 +193,22 @@
       <w:r>
         <w:rPr>
           <w:color w:val="1A1A1A"/>
-          <w:sz w:val="18"/>
+          <w:sz w:val="19"/>
         </w:rPr>
-        <w:t>•  Maintained inventory control systems using digital tracking, reducing stockouts by 10% and ensuring accurate record-keeping across all product categories</w:t>
+        <w:t>—  Maintained inventory control systems by extracting data, inputting into digital tracking systems, and ensuring accurate record-keeping — reducing stockouts by 10% across all product categories</w:t>
       </w:r>
     </w:p>
     <w:p>
       <w:pPr>
         <w:spacing w:before="120" w:after="40"/>
-        <w:shd w:val="clear" w:color="auto" w:fill="D8D8D8"/>
       </w:pPr>
       <w:r>
         <w:rPr>
           <w:b/>
           <w:color w:val="1A1A1A"/>
-          <w:sz w:val="19"/>
+          <w:sz w:val="21"/>
         </w:rPr>
-        <w:t>Operations Coordination &amp; Issue Resolution</w:t>
+        <w:t>Customer Inquiries, Escalation &amp; Process Optimization</w:t>
       </w:r>
     </w:p>
     <w:p>
@@ -221,9 +219,9 @@
       <w:r>
         <w:rPr>
           <w:color w:val="1A1A1A"/>
-          <w:sz w:val="18"/>
+          <w:sz w:val="19"/>
         </w:rPr>
-        <w:t>•  Managed daily equipment logistics, tracked supply levels, and reported shortages to management, reducing service disruptions by 20% through proactive escalation</w:t>
+        <w:t>—  Handled customer inquiries and requests across departments, providing a positive customer experience at all touchpoints while resolving service issues and improving resolution time by 10%</w:t>
       </w:r>
     </w:p>
     <w:p>
@@ -234,9 +232,9 @@
       <w:r>
         <w:rPr>
           <w:color w:val="1A1A1A"/>
-          <w:sz w:val="18"/>
+          <w:sz w:val="19"/>
         </w:rPr>
-        <w:t>•  Coordinated across departments to fulfill member requests and resolve non-routine service issues, improving resolution time by 10%</w:t>
+        <w:t>—  Escalated non-routine issues to senior team members, applying common sense and experience of similar situations to identify potential solutions — reducing service disruptions by 20% through proactive reporting</w:t>
       </w:r>
     </w:p>
     <w:p>
@@ -247,9 +245,9 @@
       <w:r>
         <w:rPr>
           <w:color w:val="1A1A1A"/>
-          <w:sz w:val="18"/>
+          <w:sz w:val="19"/>
         </w:rPr>
-        <w:t>•  Maintained organized operational records, equipment rotation schedules, and condition documentation with consistent attention to detail and accuracy</w:t>
+        <w:t>—  Contributed to process optimization by developing automated Excel tracking models and digital inventory systems that streamlined daily operations and reduced manual data entry errors</w:t>
       </w:r>
     </w:p>
     <w:p>
@@ -260,7 +258,7 @@
         <w:rPr>
           <w:b/>
           <w:color w:val="1A1A1A"/>
-          <w:sz w:val="22"/>
+          <w:sz w:val="24"/>
         </w:rPr>
         <w:t>EMPLOYMENT HISTORY</w:t>
       </w:r>
@@ -269,7 +267,7 @@
       <w:pPr>
         <w:spacing w:before="0" w:after="80"/>
         <w:pBdr>
-          <w:bottom w:val="single" w:sz="6" w:space="1" w:color="C8A951"/>
+          <w:bottom w:val="single" w:sz="6" w:space="1" w:color="E8872B"/>
         </w:pBdr>
       </w:pPr>
     </w:p>
@@ -281,23 +279,28 @@
         <w:rPr>
           <w:b/>
           <w:color w:val="1A1A1A"/>
-          <w:sz w:val="18"/>
+          <w:sz w:val="19"/>
         </w:rPr>
         <w:t>Operations &amp; Logistics</w:t>
       </w:r>
       <w:r>
         <w:rPr>
-          <w:color w:val="555555"/>
-          <w:sz w:val="18"/>
+          <w:sz w:val="19"/>
         </w:rPr>
-        <w:t xml:space="preserve"> | Bayou DeSiard Country Club</w:t>
+        <w:t xml:space="preserve">  |  </w:t>
       </w:r>
       <w:r>
         <w:rPr>
-          <w:color w:val="555555"/>
-          <w:sz w:val="18"/>
+          <w:i/>
+          <w:sz w:val="19"/>
         </w:rPr>
-        <w:t xml:space="preserve">    2025</w:t>
+        <w:t>Bayou DeSiard Country Club</w:t>
+      </w:r>
+      <w:r>
+        <w:rPr>
+          <w:sz w:val="19"/>
+        </w:rPr>
+        <w:t xml:space="preserve">  |  2025</w:t>
       </w:r>
     </w:p>
     <w:p>
@@ -308,23 +311,28 @@
         <w:rPr>
           <w:b/>
           <w:color w:val="1A1A1A"/>
-          <w:sz w:val="18"/>
+          <w:sz w:val="19"/>
         </w:rPr>
         <w:t>Accountant</w:t>
       </w:r>
       <w:r>
         <w:rPr>
-          <w:color w:val="555555"/>
-          <w:sz w:val="18"/>
+          <w:sz w:val="19"/>
         </w:rPr>
-        <w:t xml:space="preserve"> | Little and Associates, LLC</w:t>
+        <w:t xml:space="preserve">  |  </w:t>
       </w:r>
       <w:r>
         <w:rPr>
-          <w:color w:val="555555"/>
-          <w:sz w:val="18"/>
+          <w:i/>
+          <w:sz w:val="19"/>
         </w:rPr>
-        <w:t xml:space="preserve">    2020 – 2023</w:t>
+        <w:t>Little and Associates, LLC</w:t>
+      </w:r>
+      <w:r>
+        <w:rPr>
+          <w:sz w:val="19"/>
+        </w:rPr>
+        <w:t xml:space="preserve">  |  2020 – 2023</w:t>
       </w:r>
     </w:p>
     <w:p>
@@ -335,23 +343,28 @@
         <w:rPr>
           <w:b/>
           <w:color w:val="1A1A1A"/>
-          <w:sz w:val="18"/>
+          <w:sz w:val="19"/>
         </w:rPr>
         <w:t>Sales Associate</w:t>
       </w:r>
       <w:r>
         <w:rPr>
-          <w:color w:val="555555"/>
-          <w:sz w:val="18"/>
+          <w:sz w:val="19"/>
         </w:rPr>
-        <w:t xml:space="preserve"> | Office Depot</w:t>
+        <w:t xml:space="preserve">  |  </w:t>
       </w:r>
       <w:r>
         <w:rPr>
-          <w:color w:val="555555"/>
-          <w:sz w:val="18"/>
+          <w:i/>
+          <w:sz w:val="19"/>
         </w:rPr>
-        <w:t xml:space="preserve">    2020 – Present</w:t>
+        <w:t>Office Depot</w:t>
+      </w:r>
+      <w:r>
+        <w:rPr>
+          <w:sz w:val="19"/>
+        </w:rPr>
+        <w:t xml:space="preserve">  |  2020 – Present</w:t>
       </w:r>
     </w:p>
     <w:p>
@@ -362,7 +375,7 @@
         <w:rPr>
           <w:b/>
           <w:color w:val="1A1A1A"/>
-          <w:sz w:val="22"/>
+          <w:sz w:val="24"/>
         </w:rPr>
         <w:t>CREDENTIALS &amp; EDUCATION</w:t>
       </w:r>
@@ -371,7 +384,7 @@
       <w:pPr>
         <w:spacing w:before="0" w:after="80"/>
         <w:pBdr>
-          <w:bottom w:val="single" w:sz="6" w:space="1" w:color="C8A951"/>
+          <w:bottom w:val="single" w:sz="6" w:space="1" w:color="E8872B"/>
         </w:pBdr>
       </w:pPr>
     </w:p>
@@ -381,9 +394,41 @@
       </w:pPr>
       <w:r>
         <w:rPr>
-          <w:sz w:val="17"/>
+          <w:sz w:val="18"/>
         </w:rPr>
         <w:t>Licensed CPA (Arkansas &amp; Louisiana)  •  Arkansas Bar License  •  J.D., University of Arkansas  •  B.Accy., University of Mississippi</w:t>
+      </w:r>
+    </w:p>
+    <w:p>
+      <w:pPr>
+        <w:spacing w:before="200" w:after="0"/>
+      </w:pPr>
+      <w:r>
+        <w:rPr>
+          <w:b/>
+          <w:color w:val="1A1A1A"/>
+          <w:sz w:val="24"/>
+        </w:rPr>
+        <w:t>TOOLS</w:t>
+      </w:r>
+    </w:p>
+    <w:p>
+      <w:pPr>
+        <w:spacing w:before="0" w:after="80"/>
+        <w:pBdr>
+          <w:bottom w:val="single" w:sz="6" w:space="1" w:color="E8872B"/>
+        </w:pBdr>
+      </w:pPr>
+    </w:p>
+    <w:p>
+      <w:pPr>
+        <w:spacing w:after="80"/>
+      </w:pPr>
+      <w:r>
+        <w:rPr>
+          <w:sz w:val="18"/>
+        </w:rPr>
+        <w:t>Advanced Excel &amp; Financial Modeling  •  QuickBooks Desktop &amp; Online  •  NCR POS Systems  •  Digital Inventory Tracking  •  Microsoft Office Suite  •  ADP Workforce Now</w:t>
       </w:r>
     </w:p>
     <w:sectPr>

</xml_diff>